<commit_message>
Match review document fonts to article website
</commit_message>
<xml_diff>
--- a/alignment-actors-for-comments.docx
+++ b/alignment-actors-for-comments.docx
@@ -6109,7 +6109,7 @@
       <w:spacing w:line="324" w:lineRule="auto" w:after="160"/>
     </w:pPr>
     <w:rPr>
-      <w:rFonts w:ascii="Times New Roman" w:hAnsi="Times New Roman" w:eastAsia="Times New Roman" w:cs="Times New Roman"/>
+      <w:rFonts w:ascii="Adobe Caslon Pro" w:hAnsi="Adobe Caslon Pro" w:eastAsia="Adobe Caslon Pro" w:cs="Adobe Caslon Pro"/>
       <w:color w:val="000000"/>
       <w:sz w:val="24"/>
     </w:rPr>
@@ -6174,7 +6174,7 @@
       <w:outlineLvl w:val="0"/>
     </w:pPr>
     <w:rPr>
-      <w:rFonts w:ascii="Times New Roman" w:hAnsi="Times New Roman" w:eastAsia="Times New Roman" w:cs="Times New Roman"/>
+      <w:rFonts w:ascii="Test National" w:hAnsi="Test National" w:eastAsia="Test National" w:cs="Test National"/>
       <w:b/>
       <w:bCs/>
       <w:color w:val="000000"/>
@@ -6199,7 +6199,7 @@
       <w:outlineLvl w:val="1"/>
     </w:pPr>
     <w:rPr>
-      <w:rFonts w:ascii="Times New Roman" w:hAnsi="Times New Roman" w:eastAsia="Times New Roman" w:cs="Times New Roman"/>
+      <w:rFonts w:ascii="Test National" w:hAnsi="Test National" w:eastAsia="Test National" w:cs="Test National"/>
       <w:b/>
       <w:bCs/>
       <w:color w:val="000000"/>
@@ -6224,7 +6224,7 @@
       <w:outlineLvl w:val="2"/>
     </w:pPr>
     <w:rPr>
-      <w:rFonts w:ascii="Times New Roman" w:hAnsi="Times New Roman" w:eastAsia="Times New Roman" w:cs="Times New Roman"/>
+      <w:rFonts w:ascii="Test National" w:hAnsi="Test National" w:eastAsia="Test National" w:cs="Test National"/>
       <w:b/>
       <w:bCs/>
       <w:color w:val="000000"/>
@@ -6461,11 +6461,14 @@
     <w:pPr>
       <w:keepNext/>
       <w:widowControl/>
+      <w:pBdr>
+        <w:bottom w:val="single" w:sz="8" w:space="4" w:color="4F81BD" w:themeColor="accent1"/>
+      </w:pBdr>
       <w:spacing w:after="140" w:line="240" w:lineRule="auto" w:before="240"/>
       <w:contextualSpacing/>
     </w:pPr>
     <w:rPr>
-      <w:rFonts w:ascii="Times New Roman" w:hAnsi="Times New Roman" w:eastAsia="Times New Roman" w:cs="Times New Roman"/>
+      <w:rFonts w:ascii="Test National" w:hAnsi="Test National" w:eastAsia="Test National" w:cs="Test National"/>
       <w:b/>
       <w:color w:val="000000"/>
       <w:spacing w:val="5"/>
@@ -6909,7 +6912,7 @@
       <w:spacing w:line="259" w:lineRule="auto" w:after="160"/>
     </w:pPr>
     <w:rPr>
-      <w:rFonts w:ascii="Times New Roman" w:hAnsi="Times New Roman" w:eastAsia="Times New Roman" w:cs="Times New Roman"/>
+      <w:rFonts w:ascii="Adobe Caslon Pro" w:hAnsi="Adobe Caslon Pro" w:eastAsia="Adobe Caslon Pro" w:cs="Adobe Caslon Pro"/>
       <w:b/>
       <w:bCs/>
       <w:color w:val="000000"/>

</xml_diff>